<commit_message>
Enhance md2docx: Add comprehensive tests, 3 professional templates, examples, CI/CD, and AI Agent skill
</commit_message>
<xml_diff>
--- a/professional_template.docx
+++ b/professional_template.docx
@@ -6,7 +6,7 @@
       <w:headerReference w:type="default" r:id="rId9"/>
       <w:footerReference w:type="default" r:id="rId10"/>
       <w:pgSz w:w="12240" w:h="15840"/>
-      <w:pgMar w:top="1728" w:right="1728" w:bottom="1728" w:left="1728" w:header="720" w:footer="720" w:gutter="0"/>
+      <w:pgMar w:top="1440" w:right="1800" w:bottom="1440" w:left="1800" w:header="720" w:footer="720" w:gutter="0"/>
       <w:cols w:space="720"/>
       <w:docGrid w:linePitch="360"/>
     </w:sectPr>
@@ -19,15 +19,9 @@
   <w:p>
     <w:pPr>
       <w:pStyle w:val="Footer"/>
-      <w:jc w:val="center"/>
     </w:pPr>
     <w:r>
-      <w:rPr>
-        <w:rFonts w:ascii="Arial" w:hAnsi="Arial"/>
-        <w:color w:val="B4B4B4"/>
-        <w:sz w:val="16"/>
-      </w:rPr>
-      <w:t>Generated by MD2DOCX | Professional Report</w:t>
+      <w:t>Generated by md2docx</w:t>
     </w:r>
   </w:p>
 </w:ftr>
@@ -38,15 +32,9 @@
   <w:p>
     <w:pPr>
       <w:pStyle w:val="Header"/>
-      <w:jc w:val="right"/>
     </w:pPr>
     <w:r>
-      <w:rPr>
-        <w:rFonts w:ascii="Arial" w:hAnsi="Arial"/>
-        <w:color w:val="969696"/>
-        <w:sz w:val="16"/>
-      </w:rPr>
-      <w:t>CONFIDENTIAL | FOR DISCUSSION PURPOSES ONLY</w:t>
+      <w:t>CONFIDENTIAL | PROFESSIONAL REPORT</w:t>
     </w:r>
   </w:p>
 </w:hdr>
@@ -416,7 +404,7 @@
     <w:qFormat/>
     <w:rsid w:val="00FC693F"/>
     <w:pPr>
-      <w:spacing w:lineRule="auto" w:line="312" w:after="200"/>
+      <w:spacing w:line="312" w:lineRule="auto" w:after="200"/>
     </w:pPr>
     <w:rPr>
       <w:rFonts w:ascii="Arial" w:hAnsi="Arial" w:eastAsia="Microsoft YaHei"/>
@@ -527,15 +515,14 @@
     <w:pPr>
       <w:keepNext/>
       <w:keepLines/>
-      <w:spacing w:before="240" w:after="120"/>
+      <w:spacing w:before="200" w:after="0"/>
       <w:outlineLvl w:val="2"/>
     </w:pPr>
     <w:rPr>
-      <w:rFonts w:asciiTheme="majorHAnsi" w:eastAsiaTheme="majorEastAsia" w:hAnsiTheme="majorHAnsi" w:cstheme="majorBidi" w:ascii="Arial" w:hAnsi="Arial" w:eastAsia="Microsoft YaHei"/>
+      <w:rFonts w:asciiTheme="majorHAnsi" w:eastAsiaTheme="majorEastAsia" w:hAnsiTheme="majorHAnsi" w:cstheme="majorBidi"/>
       <w:b/>
       <w:bCs/>
-      <w:color w:val="505050"/>
-      <w:sz w:val="24"/>
+      <w:color w:val="4F81BD" w:themeColor="accent1"/>
     </w:rPr>
   </w:style>
   <w:style w:type="paragraph" w:styleId="Heading4">
@@ -951,13 +938,8 @@
       <w:numPr>
         <w:numId w:val="1"/>
       </w:numPr>
-      <w:spacing w:line="312" w:lineRule="auto"/>
       <w:contextualSpacing/>
     </w:pPr>
-    <w:rPr>
-      <w:rFonts w:ascii="Arial" w:hAnsi="Arial"/>
-      <w:sz w:val="21"/>
-    </w:rPr>
   </w:style>
   <w:style w:type="paragraph" w:styleId="ListBullet2">
     <w:name w:val="List Bullet 2"/>
@@ -1103,14 +1085,10 @@
     <w:uiPriority w:val="29"/>
     <w:qFormat/>
     <w:rsid w:val="00FC693F"/>
-    <w:pPr>
-      <w:ind w:left="720" w:right="720"/>
-    </w:pPr>
     <w:rPr>
-      <w:rFonts w:ascii="Arial" w:hAnsi="Arial"/>
       <w:i/>
       <w:iCs/>
-      <w:color w:val="646464"/>
+      <w:color w:val="000000" w:themeColor="text1"/>
     </w:rPr>
   </w:style>
   <w:style w:type="character" w:customStyle="1" w:styleId="QuoteChar">

</xml_diff>